<commit_message>
Restructure Database/ scripts: standalone DB creation, split ETL, fold gap-fills
Adds a standalone 00_BlueTrack_CreateDatabase.sql (never DbUp-managed) and
a Database/README.md manifest. Splits the monolithic ETL loader file into
dimension/fact/reporting-view files, folds eleven small D-58-driven
gap-fill scripts back into their parent schema/seed files, and renumbers
the remaining scripts 01-14 in dependency order, since the current
database is still initial development and fully rebuildable. Fixes two
D-89-pattern hardcoded-name bugs found while renumbering the SQL Agent job
script. Updates App/Migrator and ci.yml for the new numbering, and fixes
stale script-name references across Design Documents and code comments.

Verified against a freshly rebuilt BlueTrackTest: all 14 scripts plus the
Test fixtures apply cleanly, dotnet test 251/251, Vitest 18/18.

Co-Authored-By: Claude Sonnet 5 <noreply@anthropic.com>
</commit_message>
<xml_diff>
--- a/Database/Import_Load_Process_Guide.docx
+++ b/Database/Import_Load_Process_Guide.docx
@@ -971,7 +971,7 @@
         <w:spacing w:after="60"/>
       </w:pPr>
       <w:r>
-        <w:t xml:space="preserve">Confirm dim_date's populated range still covers the current date — usp_Load_FactAccountProgressHistory will raise an error rather than silently skip a day if it doesn't (see 04_BlueTrack_PowerBI_Support.sql's dim_date population script to extend the range).</w:t>
+        <w:t>Confirm dim_date's populated range still covers the current date — usp_Load_FactAccountProgressHistory will raise an error rather than silently skip a day if it doesn't (see 06_BlueTrack_PowerBI_Support.sql's dim_date population script to extend the range).</w:t>
       </w:r>
     </w:p>
     <w:p>
@@ -988,7 +988,7 @@
         <w:spacing w:after="140"/>
       </w:pPr>
       <w:r>
-        <w:t xml:space="preserve">Database/09_BlueTrack_ScheduleImportLoadJob.sql creates this as a single SQL Server Agent job, “BlueTrack - Import and Load”, with two steps — Import, then Load — matching the cadence above. Run it once, after Import and Load have both been confirmed working manually at least once; it drops and recreates the job if run again, so it's safe to re-run after changing anything below.</w:t>
+        <w:t>Database/14_BlueTrack_ScheduleImportLoadJob.sql creates this as a single SQL Server Agent job, “BlueTrack - Import and Load”, with two steps — Import, then Load — matching the cadence above. Run it once, after Import and Load have both been confirmed working manually at least once; it drops and recreates the job if run again, so it's safe to re-run after changing anything below.</w:t>
       </w:r>
     </w:p>
     <w:p>

</xml_diff>